<commit_message>
docs: update author name and publication city
</commit_message>
<xml_diff>
--- a/docs/poc/POC-Sentinel-Risk-Service.docx
+++ b/docs/poc/POC-Sentinel-Risk-Service.docx
@@ -14,7 +14,7 @@
           <w:i w:val="0"/>
           <w:sz w:val="24"/>
         </w:rPr>
-        <w:t>PEDRO COSTA</w:t>
+        <w:t>PEDRO IGOR CAMPOS COSTA</w:t>
       </w:r>
     </w:p>
     <w:p/>
@@ -62,7 +62,7 @@
           <w:i w:val="0"/>
           <w:sz w:val="24"/>
         </w:rPr>
-        <w:t>SÃO PAULO</w:t>
+        <w:t>SALVADOR</w:t>
         <w:br/>
         <w:t>2026</w:t>
       </w:r>
@@ -88,7 +88,7 @@
           </w:tcPr>
           <w:p>
             <w:pPr>
-              <w:spacing w:after="2400"/>
+              <w:spacing w:before="480" w:after="1920"/>
               <w:jc w:val="center"/>
             </w:pPr>
             <w:r>
@@ -98,7 +98,7 @@
                 <w:i w:val="0"/>
                 <w:sz w:val="24"/>
               </w:rPr>
-              <w:t>PEDRO COSTA</w:t>
+              <w:t>PEDRO IGOR CAMPOS COSTA</w:t>
             </w:r>
           </w:p>
         </w:tc>
@@ -150,7 +150,7 @@
           <w:i w:val="0"/>
           <w:sz w:val="24"/>
         </w:rPr>
-        <w:t>SÃO PAULO</w:t>
+        <w:t>SALVADOR</w:t>
         <w:br/>
         <w:t>2026</w:t>
       </w:r>

</xml_diff>